<commit_message>
Update AquiferOpenBibleDictionary content for 2026-10-05 release
</commit_message>
<xml_diff>
--- a/eng/docx/009.content.docx
+++ b/eng/docx/009.content.docx
@@ -17166,6 +17166,73 @@
           <w:lang w:val="en_US" w:bidi="en_US"/>
         </w:rPr>
         <w:t>Teacher</w:t>
+      </w:r>
+      <w:r>
+        <w:rPr>
+          <w:lang w:val="en_US" w:bidi="en_US"/>
+        </w:rPr>
+        <w:t>.</w:t>
+      </w:r>
+      <w:r>
+        <w:rPr>
+          <w:lang w:val="en_US" w:bidi="en_US"/>
+        </w:rPr>
+      </w:r>
+      <w:r>
+        <w:rPr>
+          <w:lang w:val="en_US" w:bidi="en_US"/>
+        </w:rPr>
+      </w:r>
+    </w:p>
+    <w:p>
+      <w:pPr/>
+      <w:r>
+        <w:rPr>
+          <w:lang w:val="en_US" w:bidi="en_US"/>
+        </w:rPr>
+      </w:r>
+    </w:p>
+    <w:p>
+      <w:pPr>
+        <w:pStyle w:val="Heading2"/>
+      </w:pPr>
+      <w:r>
+        <w:rPr>
+          <w:lang w:val="en_US" w:bidi="en_US"/>
+        </w:rPr>
+        <w:t>Instruments, Musical</w:t>
+      </w:r>
+      <w:r>
+        <w:rPr>
+          <w:lang w:val="en_US" w:bidi="en_US"/>
+        </w:rPr>
+      </w:r>
+    </w:p>
+    <w:p>
+      <w:pPr/>
+      <w:r>
+        <w:rPr>
+          <w:lang w:val="en_US" w:bidi="en_US"/>
+        </w:rPr>
+      </w:r>
+      <w:r>
+        <w:rPr>
+          <w:i/>
+          <w:lang w:val="en_US" w:bidi="en_US"/>
+        </w:rPr>
+        <w:t>See</w:t>
+      </w:r>
+      <w:r>
+        <w:rPr>
+          <w:lang w:val="en_US" w:bidi="en_US"/>
+        </w:rPr>
+        <w:t xml:space="preserve"> </w:t>
+      </w:r>
+      <w:r>
+        <w:rPr>
+          <w:lang w:val="en_US" w:bidi="en_US"/>
+        </w:rPr>
+        <w:t>Musical Instruments</w:t>
       </w:r>
       <w:r>
         <w:rPr>

</xml_diff>